<commit_message>
Ground content plan in LinkedIn audience and content analytics
</commit_message>
<xml_diff>
--- a/10xcrew-content-planning.docx
+++ b/10xcrew-content-planning.docx
@@ -375,7 +375,7 @@
           <w:b w:val="0"/>
           <w:i w:val="0"/>
         </w:rPr>
-        <w:t>This builds on the channel review and audience research already completed. The next step connects the findings to specific content, audience needs, filming choices and tests. Public YouTube listings and company material were checked on 24 September 2026, alongside official platform guidance.</w:t>
+        <w:t>This builds on the channel review and audience research already completed. The next step connects the findings to specific content, audience needs, filming choices and tests. Public YouTube listings, company material and 10XCREW's LinkedIn Page analytics were checked on 24 September 2026, alongside official platform guidance. The LinkedIn review covers follower demographics, page visitors and nine posts published between 1 July and 23 September.</w:t>
       </w:r>
     </w:p>
     <w:p>
@@ -391,7 +391,7 @@
           <w:b w:val="0"/>
           <w:i w:val="0"/>
         </w:rPr>
-        <w:t xml:space="preserve"> public posts show what was published and the response visible from outside the account. They do not identify everyone who watched. The audience choices below are proposals to check with Linda using account insights and relevant responses. Suggested scripts, timings and posting slots are production ideas.</w:t>
+        <w:t xml:space="preserve"> public posts show what was published and the response visible from outside the account. They do not identify everyone who watched. LinkedIn account analytics now add measured professional audience groups and content results. Instagram and YouTube audience choices remain proposals to check in their own account insights. Suggested scripts, timings and posting slots are production ideas.</w:t>
       </w:r>
     </w:p>
     <w:p>
@@ -730,7 +730,17 @@
           <w:b w:val="0"/>
           <w:i w:val="0"/>
         </w:rPr>
-        <w:t>These are proposed target groups based on the earlier audience research and this brief. They are not a measured description of our current followers. With Linda, compare available audience insights, comments and relevant new followers. Refine the topics around the people we actually reach.</w:t>
+        <w:t xml:space="preserve">The Instagram and YouTube groups are proposed audiences based on the research and brief. We now have measured LinkedIn audience information: business development, sales and marketing lead its follower job functions. This supports a professional focus, but it does not identify who watches our Instagram or YouTube videos. </w:t>
+      </w:r>
+      <w:r>
+        <w:t>Read the LinkedIn audience findings.</w:t>
+      </w:r>
+      <w:r>
+        <w:rPr>
+          <w:b w:val="0"/>
+          <w:i w:val="0"/>
+        </w:rPr>
+        <w:t xml:space="preserve"> Check each platform's own insights and relevant responses with Linda before refining its audience.</w:t>
       </w:r>
     </w:p>
     <w:p>
@@ -2774,7 +2784,7 @@
                 <w:i w:val="0"/>
                 <w:sz w:val="19"/>
               </w:rPr>
-              <w:t>“Come behind the scenes with us.” Show office life and teamwork.</w:t>
+              <w:t>“Before a brand workshop starts...” Show the crew preparing, checking a task and working together.</w:t>
             </w:r>
           </w:p>
         </w:tc>
@@ -2870,7 +2880,7 @@
                 <w:i w:val="0"/>
                 <w:sz w:val="19"/>
               </w:rPr>
-              <w:t>Choose a normal office day. Plan a few shots and avoid showing private information on screens.</w:t>
+              <w:t>Choose a real preparation moment in the existing plan. Film the people, task and outcome; keep private information off screen.</w:t>
             </w:r>
           </w:p>
         </w:tc>
@@ -3219,6 +3229,25 @@
       </w:tr>
     </w:tbl>
     <w:p>
+      <w:pPr>
+        <w:pStyle w:val="Caption"/>
+      </w:pPr>
+      <w:r>
+        <w:rPr>
+          <w:b/>
+          <w:i w:val="0"/>
+        </w:rPr>
+        <w:t>Why these choices:</w:t>
+      </w:r>
+      <w:r>
+        <w:rPr>
+          <w:b w:val="0"/>
+          <w:i w:val="0"/>
+        </w:rPr>
+        <w:t xml:space="preserve"> the LinkedIn findings give us a reason to test real work and collaboration in weeks 2 and 3. Instagram and YouTube still need their own results. The suggested weekdays are planning options, not measured best posting times.</w:t>
+      </w:r>
+    </w:p>
+    <w:p>
       <w:r>
         <w:rPr>
           <w:b/>
@@ -3781,7 +3810,7 @@
           <w:i w:val="0"/>
           <w:sz w:val="22"/>
         </w:rPr>
-        <w:t>LinkedIn supports the Instagram and YouTube work. Its audience here is brand, marketing and e-commerce professionals, existing contacts and potential partners. Use the selected stories to help them recognise the people and work behind 10XCREW.</w:t>
+        <w:t>LinkedIn supports the Instagram and YouTube work. Our own analytics show a mixed professional following, led by business development, sales and marketing. Show the people doing the work, with enough context for someone at another company to understand their contribution.</w:t>
       </w:r>
     </w:p>
     <w:p>
@@ -3980,24 +4009,424 @@
         <w:pStyle w:val="Heading2"/>
       </w:pPr>
       <w:r>
-        <w:t>Deeper LinkedIn audience and page review</w:t>
-      </w:r>
-    </w:p>
-    <w:p>
+        <w:t>What the account results change</w:t>
+      </w:r>
+    </w:p>
+    <w:p>
+      <w:r>
+        <w:rPr>
+          <w:b w:val="0"/>
+          <w:i w:val="0"/>
+        </w:rPr>
+        <w:t>Give people, collaboration and everyday work a clear place beside expert content. An office-training video had the most impressions in the nine-post sample. Use this as a starting point for the crew stories in weeks 2 and 3, then test the Instagram and YouTube edits on their own results.</w:t>
+      </w:r>
+    </w:p>
+    <w:p>
+      <w:pPr>
+        <w:pStyle w:val="Heading2"/>
+      </w:pPr>
+      <w:r>
+        <w:t>Who follows 10XCREW: measured LinkedIn audience</w:t>
+      </w:r>
+    </w:p>
+    <w:p>
+      <w:r>
+        <w:rPr>
+          <w:b w:val="0"/>
+          <w:i w:val="0"/>
+        </w:rPr>
+        <w:t xml:space="preserve">The Page reported </w:t>
+      </w:r>
       <w:r>
         <w:rPr>
           <w:b/>
           <w:i w:val="0"/>
         </w:rPr>
-        <w:t>Brand and e-commerce decision-makers:</w:t>
+        <w:t>3,394 followers</w:t>
       </w:r>
       <w:r>
         <w:rPr>
           <w:b w:val="0"/>
           <w:i w:val="0"/>
         </w:rPr>
-        <w:t xml:space="preserve"> a crew or client story should quickly show what the colleague contributes. Use the real company context and an understandable description of the work. This gives a professional reader a reason to remember the person and agency.</w:t>
-      </w:r>
+        <w:t xml:space="preserve"> when checked on 24 September 2026. The figures below are LinkedIn's displayed demographic shares. They describe the current following, rather than only people who followed during the last month.</w:t>
+      </w:r>
+    </w:p>
+    <w:tbl>
+      <w:tblPr>
+        <w:tblStyle w:val="TableGrid"/>
+        <w:tblW w:type="auto" w:w="0"/>
+        <w:tblLayout w:type="fixed"/>
+        <w:tblLook w:firstColumn="1" w:firstRow="1" w:lastColumn="0" w:lastRow="0" w:noHBand="0" w:noVBand="1" w:val="04A0"/>
+      </w:tblPr>
+      <w:tblGrid>
+        <w:gridCol w:w="2948"/>
+        <w:gridCol w:w="1191"/>
+        <w:gridCol w:w="5499"/>
+      </w:tblGrid>
+      <w:tr>
+        <w:trPr>
+          <w:tblHeader/>
+          <w:cantSplit/>
+        </w:trPr>
+        <w:tc>
+          <w:tcPr>
+            <w:tcW w:type="dxa" w:w="2948"/>
+            <w:shd w:fill="F0F5EF"/>
+          </w:tcPr>
+          <w:p>
+            <w:pPr>
+              <w:spacing w:after="100" w:before="80" w:line="264" w:lineRule="auto"/>
+            </w:pPr>
+            <w:r>
+              <w:rPr>
+                <w:b/>
+                <w:i w:val="0"/>
+                <w:sz w:val="19"/>
+              </w:rPr>
+              <w:t>Follower group</w:t>
+            </w:r>
+          </w:p>
+        </w:tc>
+        <w:tc>
+          <w:tcPr>
+            <w:tcW w:type="dxa" w:w="1191"/>
+            <w:shd w:fill="F0F5EF"/>
+          </w:tcPr>
+          <w:p>
+            <w:pPr>
+              <w:spacing w:after="100" w:before="80" w:line="264" w:lineRule="auto"/>
+            </w:pPr>
+            <w:r>
+              <w:rPr>
+                <w:b/>
+                <w:i w:val="0"/>
+                <w:sz w:val="19"/>
+              </w:rPr>
+              <w:t>Share</w:t>
+            </w:r>
+          </w:p>
+        </w:tc>
+        <w:tc>
+          <w:tcPr>
+            <w:tcW w:type="dxa" w:w="5499"/>
+            <w:shd w:fill="F0F5EF"/>
+          </w:tcPr>
+          <w:p>
+            <w:pPr>
+              <w:spacing w:after="100" w:before="80" w:line="264" w:lineRule="auto"/>
+            </w:pPr>
+            <w:r>
+              <w:rPr>
+                <w:b/>
+                <w:i w:val="0"/>
+                <w:sz w:val="19"/>
+              </w:rPr>
+              <w:t>Content implication to test</w:t>
+            </w:r>
+          </w:p>
+        </w:tc>
+      </w:tr>
+      <w:tr>
+        <w:trPr>
+          <w:cantSplit/>
+        </w:trPr>
+        <w:tc>
+          <w:tcPr>
+            <w:tcW w:type="dxa" w:w="2948"/>
+          </w:tcPr>
+          <w:p>
+            <w:pPr>
+              <w:spacing w:after="100" w:before="80" w:line="264" w:lineRule="auto"/>
+            </w:pPr>
+            <w:r>
+              <w:rPr>
+                <w:b w:val="0"/>
+                <w:i w:val="0"/>
+                <w:sz w:val="19"/>
+              </w:rPr>
+              <w:t>Business development</w:t>
+            </w:r>
+          </w:p>
+        </w:tc>
+        <w:tc>
+          <w:tcPr>
+            <w:tcW w:type="dxa" w:w="1191"/>
+          </w:tcPr>
+          <w:p>
+            <w:pPr>
+              <w:spacing w:after="100" w:before="80" w:line="264" w:lineRule="auto"/>
+            </w:pPr>
+            <w:r>
+              <w:rPr>
+                <w:b w:val="0"/>
+                <w:i w:val="0"/>
+                <w:sz w:val="19"/>
+              </w:rPr>
+              <w:t>18.6%</w:t>
+            </w:r>
+          </w:p>
+        </w:tc>
+        <w:tc>
+          <w:tcPr>
+            <w:tcW w:type="dxa" w:w="5499"/>
+          </w:tcPr>
+          <w:p>
+            <w:pPr>
+              <w:spacing w:after="100" w:before="80" w:line="264" w:lineRule="auto"/>
+            </w:pPr>
+            <w:r>
+              <w:rPr>
+                <w:b w:val="0"/>
+                <w:i w:val="0"/>
+                <w:sz w:val="19"/>
+              </w:rPr>
+              <w:t>Show what a collaboration involves and the people a partner would work with.</w:t>
+            </w:r>
+          </w:p>
+        </w:tc>
+      </w:tr>
+      <w:tr>
+        <w:trPr>
+          <w:cantSplit/>
+        </w:trPr>
+        <w:tc>
+          <w:tcPr>
+            <w:tcW w:type="dxa" w:w="2948"/>
+          </w:tcPr>
+          <w:p>
+            <w:pPr>
+              <w:spacing w:after="100" w:before="80" w:line="264" w:lineRule="auto"/>
+            </w:pPr>
+            <w:r>
+              <w:rPr>
+                <w:b w:val="0"/>
+                <w:i w:val="0"/>
+                <w:sz w:val="19"/>
+              </w:rPr>
+              <w:t>Sales</w:t>
+            </w:r>
+          </w:p>
+        </w:tc>
+        <w:tc>
+          <w:tcPr>
+            <w:tcW w:type="dxa" w:w="1191"/>
+          </w:tcPr>
+          <w:p>
+            <w:pPr>
+              <w:spacing w:after="100" w:before="80" w:line="264" w:lineRule="auto"/>
+            </w:pPr>
+            <w:r>
+              <w:rPr>
+                <w:b w:val="0"/>
+                <w:i w:val="0"/>
+                <w:sz w:val="19"/>
+              </w:rPr>
+              <w:t>10.9%</w:t>
+            </w:r>
+          </w:p>
+        </w:tc>
+        <w:tc>
+          <w:tcPr>
+            <w:tcW w:type="dxa" w:w="5499"/>
+          </w:tcPr>
+          <w:p>
+            <w:pPr>
+              <w:spacing w:after="100" w:before="80" w:line="264" w:lineRule="auto"/>
+            </w:pPr>
+            <w:r>
+              <w:rPr>
+                <w:b w:val="0"/>
+                <w:i w:val="0"/>
+                <w:sz w:val="19"/>
+              </w:rPr>
+              <w:t>Explain the company's role in a project clearly, without making the video a sales pitch.</w:t>
+            </w:r>
+          </w:p>
+        </w:tc>
+      </w:tr>
+      <w:tr>
+        <w:trPr>
+          <w:cantSplit/>
+        </w:trPr>
+        <w:tc>
+          <w:tcPr>
+            <w:tcW w:type="dxa" w:w="2948"/>
+          </w:tcPr>
+          <w:p>
+            <w:pPr>
+              <w:spacing w:after="100" w:before="80" w:line="264" w:lineRule="auto"/>
+            </w:pPr>
+            <w:r>
+              <w:rPr>
+                <w:b w:val="0"/>
+                <w:i w:val="0"/>
+                <w:sz w:val="19"/>
+              </w:rPr>
+              <w:t>Marketing</w:t>
+            </w:r>
+          </w:p>
+        </w:tc>
+        <w:tc>
+          <w:tcPr>
+            <w:tcW w:type="dxa" w:w="1191"/>
+          </w:tcPr>
+          <w:p>
+            <w:pPr>
+              <w:spacing w:after="100" w:before="80" w:line="264" w:lineRule="auto"/>
+            </w:pPr>
+            <w:r>
+              <w:rPr>
+                <w:b w:val="0"/>
+                <w:i w:val="0"/>
+                <w:sz w:val="19"/>
+              </w:rPr>
+              <w:t>10.2%</w:t>
+            </w:r>
+          </w:p>
+        </w:tc>
+        <w:tc>
+          <w:tcPr>
+            <w:tcW w:type="dxa" w:w="5499"/>
+          </w:tcPr>
+          <w:p>
+            <w:pPr>
+              <w:spacing w:after="100" w:before="80" w:line="264" w:lineRule="auto"/>
+            </w:pPr>
+            <w:r>
+              <w:rPr>
+                <w:b w:val="0"/>
+                <w:i w:val="0"/>
+                <w:sz w:val="19"/>
+              </w:rPr>
+              <w:t>Combine a recognisable brand or task with one useful observation from the crew.</w:t>
+            </w:r>
+          </w:p>
+        </w:tc>
+      </w:tr>
+      <w:tr>
+        <w:trPr>
+          <w:cantSplit/>
+        </w:trPr>
+        <w:tc>
+          <w:tcPr>
+            <w:tcW w:type="dxa" w:w="2948"/>
+          </w:tcPr>
+          <w:p>
+            <w:pPr>
+              <w:spacing w:after="100" w:before="80" w:line="264" w:lineRule="auto"/>
+            </w:pPr>
+            <w:r>
+              <w:rPr>
+                <w:b w:val="0"/>
+                <w:i w:val="0"/>
+                <w:sz w:val="19"/>
+              </w:rPr>
+              <w:t>Senior level</w:t>
+            </w:r>
+          </w:p>
+        </w:tc>
+        <w:tc>
+          <w:tcPr>
+            <w:tcW w:type="dxa" w:w="1191"/>
+          </w:tcPr>
+          <w:p>
+            <w:pPr>
+              <w:spacing w:after="100" w:before="80" w:line="264" w:lineRule="auto"/>
+            </w:pPr>
+            <w:r>
+              <w:rPr>
+                <w:b w:val="0"/>
+                <w:i w:val="0"/>
+                <w:sz w:val="19"/>
+              </w:rPr>
+              <w:t>32.4%</w:t>
+            </w:r>
+          </w:p>
+        </w:tc>
+        <w:tc>
+          <w:tcPr>
+            <w:tcW w:type="dxa" w:w="5499"/>
+          </w:tcPr>
+          <w:p>
+            <w:pPr>
+              <w:spacing w:after="100" w:before="80" w:line="264" w:lineRule="auto"/>
+            </w:pPr>
+            <w:r>
+              <w:rPr>
+                <w:b w:val="0"/>
+                <w:i w:val="0"/>
+                <w:sz w:val="19"/>
+              </w:rPr>
+              <w:t>Give experienced professionals a concrete work example. This category does not establish decision-making authority.</w:t>
+            </w:r>
+          </w:p>
+        </w:tc>
+      </w:tr>
+      <w:tr>
+        <w:trPr>
+          <w:cantSplit/>
+        </w:trPr>
+        <w:tc>
+          <w:tcPr>
+            <w:tcW w:type="dxa" w:w="2948"/>
+          </w:tcPr>
+          <w:p>
+            <w:pPr>
+              <w:spacing w:after="100" w:before="80" w:line="264" w:lineRule="auto"/>
+            </w:pPr>
+            <w:r>
+              <w:rPr>
+                <w:b w:val="0"/>
+                <w:i w:val="0"/>
+                <w:sz w:val="19"/>
+              </w:rPr>
+              <w:t>Entry level</w:t>
+            </w:r>
+          </w:p>
+        </w:tc>
+        <w:tc>
+          <w:tcPr>
+            <w:tcW w:type="dxa" w:w="1191"/>
+          </w:tcPr>
+          <w:p>
+            <w:pPr>
+              <w:spacing w:after="100" w:before="80" w:line="264" w:lineRule="auto"/>
+            </w:pPr>
+            <w:r>
+              <w:rPr>
+                <w:b w:val="0"/>
+                <w:i w:val="0"/>
+                <w:sz w:val="19"/>
+              </w:rPr>
+              <w:t>23.4%</w:t>
+            </w:r>
+          </w:p>
+        </w:tc>
+        <w:tc>
+          <w:tcPr>
+            <w:tcW w:type="dxa" w:w="5499"/>
+          </w:tcPr>
+          <w:p>
+            <w:pPr>
+              <w:spacing w:after="100" w:before="80" w:line="264" w:lineRule="auto"/>
+            </w:pPr>
+            <w:r>
+              <w:rPr>
+                <w:b w:val="0"/>
+                <w:i w:val="0"/>
+                <w:sz w:val="19"/>
+              </w:rPr>
+              <w:t>Explain roles and specialist terms so newer professionals can follow the story too.</w:t>
+            </w:r>
+          </w:p>
+        </w:tc>
+      </w:tr>
+    </w:tbl>
+    <w:p>
+      <w:pPr>
+        <w:spacing w:after="20"/>
+      </w:pPr>
     </w:p>
     <w:p>
       <w:r>
@@ -4005,14 +4434,14 @@
           <w:b/>
           <w:i w:val="0"/>
         </w:rPr>
-        <w:t>Partners and event contacts:</w:t>
+        <w:t>Industry:</w:t>
       </w:r>
       <w:r>
         <w:rPr>
           <w:b w:val="0"/>
           <w:i w:val="0"/>
         </w:rPr>
-        <w:t xml:space="preserve"> connect the post to the shared event or collaboration and credit the people involved. Colleagues can add their perspective if they want to. A personal contribution should sound like that person and add something to the company post.</w:t>
+        <w:t xml:space="preserve"> advertising services leads the displayed categories at 6.4%; retail and IT services each account for 6.0%. The following includes peers and a wider business community. It is not a list of potential clients.</w:t>
       </w:r>
     </w:p>
     <w:p>
@@ -4021,6 +4450,494 @@
           <w:b/>
           <w:i w:val="0"/>
         </w:rPr>
+        <w:t>Company size:</w:t>
+      </w:r>
+      <w:r>
+        <w:rPr>
+          <w:b w:val="0"/>
+          <w:i w:val="0"/>
+        </w:rPr>
+        <w:t xml:space="preserve"> 11 to 50 employees (16.1%) and 51 to 200 (14.0%) are the largest named groups. Companies with more than 10,000 employees also appear (12.2%). Use accessible work examples instead of assuming everyone works at the same kind of company.</w:t>
+      </w:r>
+    </w:p>
+    <w:p>
+      <w:r>
+        <w:rPr>
+          <w:b/>
+          <w:i w:val="0"/>
+        </w:rPr>
+        <w:t>Location:</w:t>
+      </w:r>
+      <w:r>
+        <w:rPr>
+          <w:b w:val="0"/>
+          <w:i w:val="0"/>
+        </w:rPr>
+        <w:t xml:space="preserve"> Randstad (27.5%) and the Brabant city region (26.2%) lead LinkedIn's location categories. Local office and event stories are reasonable tests. Keep the company-channel language choice with Linda; location alone does not establish someone's preferred language.</w:t>
+      </w:r>
+    </w:p>
+    <w:p>
+      <w:pPr>
+        <w:pStyle w:val="Caption"/>
+      </w:pPr>
+      <w:r>
+        <w:rPr>
+          <w:b w:val="0"/>
+          <w:i w:val="0"/>
+        </w:rPr>
+        <w:t xml:space="preserve">Source: 10XCREW LinkedIn Page follower analytics, observed 24 September 2026. LinkedIn's in-account explanation bases these percentages on followers with standardised demographic information and excludes followers that are Pages. Job function and seniority are separate breakdowns; do not add their percentages. These findings do not measure the Instagram or YouTube audience. See </w:t>
+      </w:r>
+      <w:hyperlink r:id="rId24">
+        <w:r>
+          <w:rPr>
+            <w:color w:val="00747B"/>
+            <w:u w:val="single"/>
+          </w:rPr>
+          <w:t>LinkedIn's follower report guidance</w:t>
+        </w:r>
+      </w:hyperlink>
+      <w:r>
+        <w:rPr>
+          <w:sz w:val="16"/>
+        </w:rPr>
+        <w:t xml:space="preserve"> [13]</w:t>
+      </w:r>
+      <w:r>
+        <w:rPr>
+          <w:b w:val="0"/>
+          <w:i w:val="0"/>
+        </w:rPr>
+        <w:t>.</w:t>
+      </w:r>
+    </w:p>
+    <w:p>
+      <w:pPr>
+        <w:pStyle w:val="Heading2"/>
+      </w:pPr>
+      <w:r>
+        <w:t>What nine recent LinkedIn posts suggest</w:t>
+      </w:r>
+    </w:p>
+    <w:p>
+      <w:r>
+        <w:rPr>
+          <w:b w:val="0"/>
+          <w:i w:val="0"/>
+        </w:rPr>
+        <w:t xml:space="preserve">The content table returned nine posts published from </w:t>
+      </w:r>
+      <w:r>
+        <w:rPr>
+          <w:b/>
+          <w:i w:val="0"/>
+        </w:rPr>
+        <w:t>1 July to 23 September 2026</w:t>
+      </w:r>
+      <w:r>
+        <w:rPr>
+          <w:b w:val="0"/>
+          <w:i w:val="0"/>
+        </w:rPr>
+        <w:t>: two videos, three documents and four image posts. The examples below show why we should test a mix of people, work and expertise.</w:t>
+      </w:r>
+    </w:p>
+    <w:tbl>
+      <w:tblPr>
+        <w:tblStyle w:val="TableGrid"/>
+        <w:tblW w:type="auto" w:w="0"/>
+        <w:tblLayout w:type="fixed"/>
+        <w:tblLook w:firstColumn="1" w:firstRow="1" w:lastColumn="0" w:lastRow="0" w:noHBand="0" w:noVBand="1" w:val="04A0"/>
+      </w:tblPr>
+      <w:tblGrid>
+        <w:gridCol w:w="2948"/>
+        <w:gridCol w:w="1191"/>
+        <w:gridCol w:w="5499"/>
+      </w:tblGrid>
+      <w:tr>
+        <w:trPr>
+          <w:tblHeader/>
+          <w:cantSplit/>
+        </w:trPr>
+        <w:tc>
+          <w:tcPr>
+            <w:tcW w:type="dxa" w:w="2948"/>
+            <w:shd w:fill="F0F5EF"/>
+          </w:tcPr>
+          <w:p>
+            <w:pPr>
+              <w:spacing w:after="100" w:before="80" w:line="264" w:lineRule="auto"/>
+            </w:pPr>
+            <w:r>
+              <w:rPr>
+                <w:b/>
+                <w:i w:val="0"/>
+                <w:sz w:val="19"/>
+              </w:rPr>
+              <w:t>Example and publication date</w:t>
+            </w:r>
+          </w:p>
+        </w:tc>
+        <w:tc>
+          <w:tcPr>
+            <w:tcW w:type="dxa" w:w="1191"/>
+            <w:shd w:fill="F0F5EF"/>
+          </w:tcPr>
+          <w:p>
+            <w:pPr>
+              <w:spacing w:after="100" w:before="80" w:line="264" w:lineRule="auto"/>
+            </w:pPr>
+            <w:r>
+              <w:rPr>
+                <w:b/>
+                <w:i w:val="0"/>
+                <w:sz w:val="19"/>
+              </w:rPr>
+              <w:t>Impressions</w:t>
+            </w:r>
+          </w:p>
+        </w:tc>
+        <w:tc>
+          <w:tcPr>
+            <w:tcW w:type="dxa" w:w="5499"/>
+            <w:shd w:fill="F0F5EF"/>
+          </w:tcPr>
+          <w:p>
+            <w:pPr>
+              <w:spacing w:after="100" w:before="80" w:line="264" w:lineRule="auto"/>
+            </w:pPr>
+            <w:r>
+              <w:rPr>
+                <w:b/>
+                <w:i w:val="0"/>
+                <w:sz w:val="19"/>
+              </w:rPr>
+              <w:t>What to take into the plan</w:t>
+            </w:r>
+          </w:p>
+        </w:tc>
+      </w:tr>
+      <w:tr>
+        <w:trPr>
+          <w:cantSplit/>
+        </w:trPr>
+        <w:tc>
+          <w:tcPr>
+            <w:tcW w:type="dxa" w:w="2948"/>
+          </w:tcPr>
+          <w:p>
+            <w:pPr>
+              <w:spacing w:after="100" w:before="80" w:line="264" w:lineRule="auto"/>
+            </w:pPr>
+            <w:r>
+              <w:rPr>
+                <w:b w:val="0"/>
+                <w:i w:val="0"/>
+                <w:sz w:val="19"/>
+              </w:rPr>
+              <w:t>Office-training video, 31 August</w:t>
+            </w:r>
+          </w:p>
+        </w:tc>
+        <w:tc>
+          <w:tcPr>
+            <w:tcW w:type="dxa" w:w="1191"/>
+          </w:tcPr>
+          <w:p>
+            <w:pPr>
+              <w:spacing w:after="100" w:before="80" w:line="264" w:lineRule="auto"/>
+            </w:pPr>
+            <w:r>
+              <w:rPr>
+                <w:b w:val="0"/>
+                <w:i w:val="0"/>
+                <w:sz w:val="19"/>
+              </w:rPr>
+              <w:t>1,560</w:t>
+            </w:r>
+          </w:p>
+        </w:tc>
+        <w:tc>
+          <w:tcPr>
+            <w:tcW w:type="dxa" w:w="5499"/>
+          </w:tcPr>
+          <w:p>
+            <w:pPr>
+              <w:spacing w:after="100" w:before="80" w:line="264" w:lineRule="auto"/>
+            </w:pPr>
+            <w:r>
+              <w:rPr>
+                <w:b w:val="0"/>
+                <w:i w:val="0"/>
+                <w:sz w:val="19"/>
+              </w:rPr>
+              <w:t>The largest count in the sample. Test a real work moment with colleagues, a clear activity and a shared lesson.</w:t>
+            </w:r>
+          </w:p>
+        </w:tc>
+      </w:tr>
+      <w:tr>
+        <w:trPr>
+          <w:cantSplit/>
+        </w:trPr>
+        <w:tc>
+          <w:tcPr>
+            <w:tcW w:type="dxa" w:w="2948"/>
+          </w:tcPr>
+          <w:p>
+            <w:pPr>
+              <w:spacing w:after="100" w:before="80" w:line="264" w:lineRule="auto"/>
+            </w:pPr>
+            <w:r>
+              <w:rPr>
+                <w:b w:val="0"/>
+                <w:i w:val="0"/>
+                <w:sz w:val="19"/>
+              </w:rPr>
+              <w:t>Recruitment image post, 8 July</w:t>
+            </w:r>
+          </w:p>
+        </w:tc>
+        <w:tc>
+          <w:tcPr>
+            <w:tcW w:type="dxa" w:w="1191"/>
+          </w:tcPr>
+          <w:p>
+            <w:pPr>
+              <w:spacing w:after="100" w:before="80" w:line="264" w:lineRule="auto"/>
+            </w:pPr>
+            <w:r>
+              <w:rPr>
+                <w:b w:val="0"/>
+                <w:i w:val="0"/>
+                <w:sz w:val="19"/>
+              </w:rPr>
+              <w:t>523</w:t>
+            </w:r>
+          </w:p>
+        </w:tc>
+        <w:tc>
+          <w:tcPr>
+            <w:tcW w:type="dxa" w:w="5499"/>
+          </w:tcPr>
+          <w:p>
+            <w:pPr>
+              <w:spacing w:after="100" w:before="80" w:line="264" w:lineRule="auto"/>
+            </w:pPr>
+            <w:r>
+              <w:rPr>
+                <w:b w:val="0"/>
+                <w:i w:val="0"/>
+                <w:sz w:val="19"/>
+              </w:rPr>
+              <w:t>People-related content can attract attention, including job seekers. That is a different audience need from understanding our collaborations.</w:t>
+            </w:r>
+          </w:p>
+        </w:tc>
+      </w:tr>
+      <w:tr>
+        <w:trPr>
+          <w:cantSplit/>
+        </w:trPr>
+        <w:tc>
+          <w:tcPr>
+            <w:tcW w:type="dxa" w:w="2948"/>
+          </w:tcPr>
+          <w:p>
+            <w:pPr>
+              <w:spacing w:after="100" w:before="80" w:line="264" w:lineRule="auto"/>
+            </w:pPr>
+            <w:r>
+              <w:rPr>
+                <w:b w:val="0"/>
+                <w:i w:val="0"/>
+                <w:sz w:val="19"/>
+              </w:rPr>
+              <w:t>Webshop and marketplace document, 24 August</w:t>
+            </w:r>
+          </w:p>
+        </w:tc>
+        <w:tc>
+          <w:tcPr>
+            <w:tcW w:type="dxa" w:w="1191"/>
+          </w:tcPr>
+          <w:p>
+            <w:pPr>
+              <w:spacing w:after="100" w:before="80" w:line="264" w:lineRule="auto"/>
+            </w:pPr>
+            <w:r>
+              <w:rPr>
+                <w:b w:val="0"/>
+                <w:i w:val="0"/>
+                <w:sz w:val="19"/>
+              </w:rPr>
+              <w:t>426</w:t>
+            </w:r>
+          </w:p>
+        </w:tc>
+        <w:tc>
+          <w:tcPr>
+            <w:tcW w:type="dxa" w:w="5499"/>
+          </w:tcPr>
+          <w:p>
+            <w:pPr>
+              <w:spacing w:after="100" w:before="80" w:line="264" w:lineRule="auto"/>
+            </w:pPr>
+            <w:r>
+              <w:rPr>
+                <w:b w:val="0"/>
+                <w:i w:val="0"/>
+                <w:sz w:val="19"/>
+              </w:rPr>
+              <w:t>Keep expertise in the mix. Let a recognisable colleague explain one part of a useful topic on camera.</w:t>
+            </w:r>
+          </w:p>
+        </w:tc>
+      </w:tr>
+      <w:tr>
+        <w:trPr>
+          <w:cantSplit/>
+        </w:trPr>
+        <w:tc>
+          <w:tcPr>
+            <w:tcW w:type="dxa" w:w="2948"/>
+          </w:tcPr>
+          <w:p>
+            <w:pPr>
+              <w:spacing w:after="100" w:before="80" w:line="264" w:lineRule="auto"/>
+            </w:pPr>
+            <w:r>
+              <w:rPr>
+                <w:b w:val="0"/>
+                <w:i w:val="0"/>
+                <w:sz w:val="19"/>
+              </w:rPr>
+              <w:t>Marketplace event announcement video, 16 September</w:t>
+            </w:r>
+          </w:p>
+        </w:tc>
+        <w:tc>
+          <w:tcPr>
+            <w:tcW w:type="dxa" w:w="1191"/>
+          </w:tcPr>
+          <w:p>
+            <w:pPr>
+              <w:spacing w:after="100" w:before="80" w:line="264" w:lineRule="auto"/>
+            </w:pPr>
+            <w:r>
+              <w:rPr>
+                <w:b w:val="0"/>
+                <w:i w:val="0"/>
+                <w:sz w:val="19"/>
+              </w:rPr>
+              <w:t>290</w:t>
+            </w:r>
+          </w:p>
+        </w:tc>
+        <w:tc>
+          <w:tcPr>
+            <w:tcW w:type="dxa" w:w="5499"/>
+          </w:tcPr>
+          <w:p>
+            <w:pPr>
+              <w:spacing w:after="100" w:before="80" w:line="264" w:lineRule="auto"/>
+            </w:pPr>
+            <w:r>
+              <w:rPr>
+                <w:b w:val="0"/>
+                <w:i w:val="0"/>
+                <w:sz w:val="19"/>
+              </w:rPr>
+              <w:t>A video format alone does not guarantee attention. Test an opening that shows the crew's involvement in the story.</w:t>
+            </w:r>
+          </w:p>
+        </w:tc>
+      </w:tr>
+    </w:tbl>
+    <w:p>
+      <w:pPr>
+        <w:spacing w:after="20"/>
+      </w:pPr>
+    </w:p>
+    <w:p>
+      <w:r>
+        <w:rPr>
+          <w:b/>
+          <w:i w:val="0"/>
+        </w:rPr>
+        <w:t>Interpretation:</w:t>
+      </w:r>
+      <w:r>
+        <w:rPr>
+          <w:b w:val="0"/>
+          <w:i w:val="0"/>
+        </w:rPr>
+        <w:t xml:space="preserve"> this is a small, uneven sample, with different subjects and time online. It does not prove that a format causes better performance. The figures do support testing company branding alongside expert content.</w:t>
+      </w:r>
+    </w:p>
+    <w:p>
+      <w:r>
+        <w:rPr>
+          <w:b/>
+          <w:i w:val="0"/>
+        </w:rPr>
+        <w:t>Read engagement carefully:</w:t>
+      </w:r>
+      <w:r>
+        <w:rPr>
+          <w:b w:val="0"/>
+          <w:i w:val="0"/>
+        </w:rPr>
+        <w:t xml:space="preserve"> the webshop and marketplace document shows a 31.92% engagement rate, including 130 clicks. Clicks can involve the content, company name or logo; they are not all website visits. A high engagement rate does not show how many people remember 10XCREW.</w:t>
+      </w:r>
+    </w:p>
+    <w:p>
+      <w:pPr>
+        <w:pStyle w:val="Caption"/>
+      </w:pPr>
+      <w:r>
+        <w:rPr>
+          <w:b w:val="0"/>
+          <w:i w:val="0"/>
+        </w:rPr>
+        <w:t xml:space="preserve">Source: 10XCREW LinkedIn Page content analytics, observed 24 September 2026. The table's date filter selects when posts were published; its post totals are a snapshot, not activity restricted to that period. They should not be added to the monthly baseline below. Impressions can include repeated displays. See </w:t>
+      </w:r>
+      <w:hyperlink r:id="rId25">
+        <w:r>
+          <w:rPr>
+            <w:color w:val="00747B"/>
+            <w:u w:val="single"/>
+          </w:rPr>
+          <w:t>LinkedIn's content metric definitions</w:t>
+        </w:r>
+      </w:hyperlink>
+      <w:r>
+        <w:rPr>
+          <w:sz w:val="16"/>
+        </w:rPr>
+        <w:t xml:space="preserve"> [14]</w:t>
+      </w:r>
+      <w:r>
+        <w:rPr>
+          <w:b w:val="0"/>
+          <w:i w:val="0"/>
+        </w:rPr>
+        <w:t>.</w:t>
+      </w:r>
+    </w:p>
+    <w:p>
+      <w:pPr>
+        <w:pStyle w:val="Heading2"/>
+      </w:pPr>
+      <w:r>
+        <w:t>Page wording and optimisation</w:t>
+      </w:r>
+    </w:p>
+    <w:p>
+      <w:r>
+        <w:rPr>
+          <w:b/>
+          <w:i w:val="0"/>
+        </w:rPr>
         <w:t>Observed in the public page returned on 24 September:</w:t>
       </w:r>
       <w:r>
@@ -4030,7 +4947,7 @@
         </w:rPr>
         <w:t xml:space="preserve"> the tagline reads “Creating online solutions for growth.” The listed specialties focus on marketplaces, while the About text also discusses social commerce, webshops and CRM. The </w:t>
       </w:r>
-      <w:hyperlink r:id="rId24">
+      <w:hyperlink r:id="rId26">
         <w:r>
           <w:rPr>
             <w:color w:val="00747B"/>
@@ -4043,7 +4960,7 @@
         <w:rPr>
           <w:sz w:val="16"/>
         </w:rPr>
-        <w:t xml:space="preserve"> [13]</w:t>
+        <w:t xml:space="preserve"> [15]</w:t>
       </w:r>
       <w:r>
         <w:rPr>
@@ -4052,7 +4969,7 @@
         </w:rPr>
         <w:t xml:space="preserve"> and </w:t>
       </w:r>
-      <w:hyperlink r:id="rId25">
+      <w:hyperlink r:id="rId27">
         <w:r>
           <w:rPr>
             <w:color w:val="00747B"/>
@@ -4065,7 +4982,7 @@
         <w:rPr>
           <w:sz w:val="16"/>
         </w:rPr>
-        <w:t xml:space="preserve"> [14]</w:t>
+        <w:t xml:space="preserve"> [16]</w:t>
       </w:r>
       <w:r>
         <w:rPr>
@@ -4147,16 +5064,16 @@
           <w:b/>
           <w:i w:val="0"/>
         </w:rPr>
-        <w:t>Validate the audience:</w:t>
+        <w:t>Follow up with Linda:</w:t>
       </w:r>
       <w:r>
         <w:rPr>
           <w:b w:val="0"/>
           <w:i w:val="0"/>
         </w:rPr>
-        <w:t xml:space="preserve"> review job function, industry and seniority in Page visitor analytics when enough data is available. Compare those broad groups with the intended audience; do not assume every visitor is a potential client. </w:t>
-      </w:r>
-      <w:hyperlink r:id="rId26">
+        <w:t xml:space="preserve"> after the four-week test, review whether visitor demographics and relevant responses still match the professional audience we want to reach. Follower demographics describe the existing community; visitor analytics describe page activity. Keep those reports separate. </w:t>
+      </w:r>
+      <w:hyperlink r:id="rId28">
         <w:r>
           <w:rPr>
             <w:color w:val="00747B"/>
@@ -4169,7 +5086,7 @@
         <w:rPr>
           <w:sz w:val="16"/>
         </w:rPr>
-        <w:t xml:space="preserve"> [15]</w:t>
+        <w:t xml:space="preserve"> [17]</w:t>
       </w:r>
       <w:r>
         <w:rPr>
@@ -4273,7 +5190,7 @@
         </w:rPr>
         <w:t xml:space="preserve">Use account Insights and </w:t>
       </w:r>
-      <w:hyperlink r:id="rId27">
+      <w:hyperlink r:id="rId29">
         <w:r>
           <w:rPr>
             <w:color w:val="00747B"/>
@@ -4286,7 +5203,7 @@
         <w:rPr>
           <w:sz w:val="16"/>
         </w:rPr>
-        <w:t xml:space="preserve"> [16]</w:t>
+        <w:t xml:space="preserve"> [18]</w:t>
       </w:r>
       <w:r>
         <w:rPr>
@@ -4438,6 +5355,103 @@
         <w:pStyle w:val="Heading2"/>
       </w:pPr>
       <w:r>
+        <w:t>Our LinkedIn starting point</w:t>
+      </w:r>
+    </w:p>
+    <w:p>
+      <w:r>
+        <w:rPr>
+          <w:b w:val="0"/>
+          <w:i w:val="0"/>
+        </w:rPr>
+        <w:t xml:space="preserve">Activity from </w:t>
+      </w:r>
+      <w:r>
+        <w:rPr>
+          <w:b/>
+          <w:i w:val="0"/>
+        </w:rPr>
+        <w:t>24 August to 22 September 2026</w:t>
+      </w:r>
+      <w:r>
+        <w:rPr>
+          <w:b w:val="0"/>
+          <w:i w:val="0"/>
+        </w:rPr>
+        <w:t>, checked on 24 September.</w:t>
+      </w:r>
+    </w:p>
+    <w:p>
+      <w:r>
+        <w:rPr>
+          <w:b w:val="0"/>
+          <w:i w:val="0"/>
+        </w:rPr>
+        <w:t>2,686</w:t>
+      </w:r>
+    </w:p>
+    <w:p>
+      <w:r>
+        <w:rPr>
+          <w:b w:val="0"/>
+          <w:i w:val="0"/>
+        </w:rPr>
+        <w:t>Content impressions</w:t>
+      </w:r>
+    </w:p>
+    <w:p>
+      <w:r>
+        <w:rPr>
+          <w:b w:val="0"/>
+          <w:i w:val="0"/>
+        </w:rPr>
+        <w:t>44</w:t>
+      </w:r>
+    </w:p>
+    <w:p>
+      <w:r>
+        <w:rPr>
+          <w:b w:val="0"/>
+          <w:i w:val="0"/>
+        </w:rPr>
+        <w:t>Content reactions</w:t>
+      </w:r>
+    </w:p>
+    <w:p>
+      <w:r>
+        <w:rPr>
+          <w:b w:val="0"/>
+          <w:i w:val="0"/>
+        </w:rPr>
+        <w:t>439</w:t>
+      </w:r>
+    </w:p>
+    <w:p>
+      <w:r>
+        <w:rPr>
+          <w:b w:val="0"/>
+          <w:i w:val="0"/>
+        </w:rPr>
+        <w:t>Company page views</w:t>
+      </w:r>
+    </w:p>
+    <w:p>
+      <w:pPr>
+        <w:pStyle w:val="Caption"/>
+      </w:pPr>
+      <w:r>
+        <w:rPr>
+          <w:b w:val="0"/>
+          <w:i w:val="0"/>
+        </w:rPr>
+        <w:t>Source: 10XCREW LinkedIn Page content and visitor reports. The content report shows no sponsored impressions in this period. Impressions and page views are different measures and can include repeat views. They do not count distinct people or prove brand recognition.</w:t>
+      </w:r>
+    </w:p>
+    <w:p>
+      <w:pPr>
+        <w:pStyle w:val="Heading2"/>
+      </w:pPr>
+      <w:r>
         <w:t>Keep the review practical</w:t>
       </w:r>
     </w:p>
@@ -4447,7 +5461,7 @@
           <w:b w:val="0"/>
           <w:i w:val="0"/>
         </w:rPr>
-        <w:t>Save each post's results after the same period, for example seven days, and discuss the four-week group together. Compare Reels with Reels and Shorts with Shorts. Look for patterns in people, topics and openings, then choose what to repeat or improve.</w:t>
+        <w:t>Save each new post's results seven days after publication and discuss the four-week group together. Record the platform, topic, hook, format, posting date, result and any relevant response. Compare Reels with Reels and Shorts with Shorts. Look for patterns in people, topics and openings, then choose what to repeat or improve.</w:t>
       </w:r>
     </w:p>
     <w:p>
@@ -4456,9 +5470,9 @@
           <w:b w:val="0"/>
           <w:i w:val="0"/>
         </w:rPr>
-        <w:t xml:space="preserve">Start with the accounts' own baseline and agree realistic goals with Linda. Use the </w:t>
-      </w:r>
-      <w:hyperlink r:id="rId28">
+        <w:t xml:space="preserve">Use the measured LinkedIn baseline above for context and save the previous 30 complete days from Instagram Insights and YouTube Studio when those reports are available. Those two baselines have not been verified here. Agree goals with Linda once they are recorded. Use the </w:t>
+      </w:r>
+      <w:hyperlink r:id="rId30">
         <w:r>
           <w:rPr>
             <w:color w:val="00747B"/>
@@ -4471,14 +5485,14 @@
         <w:rPr>
           <w:sz w:val="16"/>
         </w:rPr>
-        <w:t xml:space="preserve"> [17]</w:t>
+        <w:t xml:space="preserve"> [19]</w:t>
       </w:r>
       <w:r>
         <w:rPr>
           <w:b w:val="0"/>
           <w:i w:val="0"/>
         </w:rPr>
-        <w:t xml:space="preserve"> for guidance specific to the account. This plan does not set consumer sales targets.</w:t>
+        <w:t xml:space="preserve"> for account-specific guidance.</w:t>
       </w:r>
     </w:p>
     <w:p>
@@ -4545,6 +5559,23 @@
         <w:pStyle w:val="Heading3"/>
       </w:pPr>
       <w:r>
+        <w:t>Compare the same kind of result</w:t>
+      </w:r>
+    </w:p>
+    <w:p>
+      <w:r>
+        <w:rPr>
+          <w:b w:val="0"/>
+          <w:i w:val="0"/>
+        </w:rPr>
+        <w:t>Review the next 30 complete days against the LinkedIn baseline, recording posting volume and any paid support too. More posts can increase total impressions without improving each post. Keep the seven-day post snapshots separate from these account totals. This plan uses awareness measures rather than consumer sales targets.</w:t>
+      </w:r>
+    </w:p>
+    <w:p>
+      <w:pPr>
+        <w:pStyle w:val="Heading3"/>
+      </w:pPr>
+      <w:r>
         <w:t>What to change after a review</w:t>
       </w:r>
     </w:p>
@@ -4598,7 +5629,7 @@
           <w:b w:val="0"/>
           <w:i w:val="0"/>
         </w:rPr>
-        <w:t>Place the selected ideas in the existing calendar and save a starting point for the results.</w:t>
+        <w:t>Place the selected ideas in the existing calendar. Use the LinkedIn findings and record separate Instagram and YouTube baselines before the test.</w:t>
       </w:r>
     </w:p>
     <w:p>
@@ -4614,7 +5645,7 @@
         <w:pStyle w:val="Caption"/>
       </w:pPr>
       <w:r>
-        <w:t>The plan builds on the channel review of 17 September 2026 and the follow-up audience, branding and LinkedIn research. Public video listings and company material were checked again on 24 September 2026. Platform guidance supports the feature and measurement descriptions; content ideas and audience choices remain proposals to test with Linda.</w:t>
+        <w:t>The plan builds on the channel review of 17 September 2026 and the follow-up audience, branding and LinkedIn research. Public video listings, company material and 10XCREW LinkedIn Page analytics were checked on 24 September 2026. The LinkedIn review adds measured follower demographics, content results and a dated baseline. Instagram and YouTube audience choices remain proposals until their own account insights are reviewed. Platform guidance supports the feature and measurement descriptions; content ideas remain proposals to test with Linda.</w:t>
       </w:r>
     </w:p>
     <w:p>
@@ -4903,10 +5934,56 @@
           <w:b/>
           <w:sz w:val="18"/>
         </w:rPr>
-        <w:t>13. public company page</w:t>
+        <w:t>13. LinkedIn's follower report guidance</w:t>
         <w:br/>
       </w:r>
       <w:hyperlink r:id="rId24">
+        <w:r>
+          <w:rPr>
+            <w:color w:val="00747B"/>
+            <w:u w:val="single"/>
+          </w:rPr>
+          <w:t>https://www.linkedin.com/help/linkedin/answer/a570460</w:t>
+        </w:r>
+      </w:hyperlink>
+    </w:p>
+    <w:p>
+      <w:pPr>
+        <w:keepLines/>
+        <w:spacing w:after="160"/>
+      </w:pPr>
+      <w:r>
+        <w:rPr>
+          <w:b/>
+          <w:sz w:val="18"/>
+        </w:rPr>
+        <w:t>14. LinkedIn's content metric definitions</w:t>
+        <w:br/>
+      </w:r>
+      <w:hyperlink r:id="rId25">
+        <w:r>
+          <w:rPr>
+            <w:color w:val="00747B"/>
+            <w:u w:val="single"/>
+          </w:rPr>
+          <w:t>https://www.linkedin.com/help/linkedin/answer/a564051</w:t>
+        </w:r>
+      </w:hyperlink>
+    </w:p>
+    <w:p>
+      <w:pPr>
+        <w:keepLines/>
+        <w:spacing w:after="160"/>
+      </w:pPr>
+      <w:r>
+        <w:rPr>
+          <w:b/>
+          <w:sz w:val="18"/>
+        </w:rPr>
+        <w:t>15. public company page</w:t>
+        <w:br/>
+      </w:r>
+      <w:hyperlink r:id="rId26">
         <w:r>
           <w:rPr>
             <w:color w:val="00747B"/>
@@ -4926,10 +6003,10 @@
           <w:b/>
           <w:sz w:val="18"/>
         </w:rPr>
-        <w:t>14. website</w:t>
+        <w:t>16. website</w:t>
         <w:br/>
       </w:r>
-      <w:hyperlink r:id="rId25">
+      <w:hyperlink r:id="rId27">
         <w:r>
           <w:rPr>
             <w:color w:val="00747B"/>
@@ -4949,10 +6026,10 @@
           <w:b/>
           <w:sz w:val="18"/>
         </w:rPr>
-        <w:t>15. LinkedIn visitor analytics guidance</w:t>
+        <w:t>17. LinkedIn visitor analytics guidance</w:t>
         <w:br/>
       </w:r>
-      <w:hyperlink r:id="rId26">
+      <w:hyperlink r:id="rId28">
         <w:r>
           <w:rPr>
             <w:color w:val="00747B"/>
@@ -4972,10 +6049,10 @@
           <w:b/>
           <w:sz w:val="18"/>
         </w:rPr>
-        <w:t>16. Meta's Reel watch-time guidance</w:t>
+        <w:t>18. Meta's Reel watch-time guidance</w:t>
         <w:br/>
       </w:r>
-      <w:hyperlink r:id="rId27">
+      <w:hyperlink r:id="rId29">
         <w:r>
           <w:rPr>
             <w:color w:val="00747B"/>
@@ -4995,10 +6072,10 @@
           <w:b/>
           <w:sz w:val="18"/>
         </w:rPr>
-        <w:t>17. Instagram professional dashboard</w:t>
+        <w:t>19. Instagram professional dashboard</w:t>
         <w:br/>
       </w:r>
-      <w:hyperlink r:id="rId28">
+      <w:hyperlink r:id="rId30">
         <w:r>
           <w:rPr>
             <w:color w:val="00747B"/>

</xml_diff>